<commit_message>
docs(examples): cover run bdr/kern/eastAsianLayout/rStyle + paragraph framePr
run-showcase and paragraph-showcase only exercised the schema-declared
settable surface (43 run / 60 paragraph keys). They missed handler-supported
keys the schema does not enumerate. Add them and correct the stale note that
claimed kern is not a docx run property.

- run-showcase: new section for kern, eastAsianLayout.vert/.combine (implicit
  run) plus bdr and run-level rStyle (explicit run children, since on a
  paragraph those bind the paragraph border / paragraph-mark style)
- paragraph-showcase: new framePr.* text-frame section
- fix run-showcase.md kern description (charSpacing vs kern are distinct)
- regenerate both .docx; validate passes
</commit_message>
<xml_diff>
--- a/examples/word/paragraph-showcase.docx
+++ b/examples/word/paragraph-showcase.docx
@@ -588,6 +588,28 @@
       <w:r>
         <w:rPr/>
         <w:t xml:space="preserve">mark: italic/strike/underline/size/highlight/fonts</w:t>
+      </w:r>
+    </w:p>
+    <w:p>
+      <w:pPr>
+        <w:spacing w:before="200"/>
+      </w:pPr>
+      <w:r>
+        <w:rPr>
+          <w:b/>
+          <w:color w:val="1F4E79"/>
+          <w:sz w:val="28"/>
+        </w:rPr>
+        <w:t xml:space="preserve">Text frame (framePr)</w:t>
+      </w:r>
+    </w:p>
+    <w:p>
+      <w:pPr>
+        <w:framePr w:w="4320" w:h="720" w:vSpace="180" w:hSpace="180" w:wrap="around" w:hAnchor="margin" w:vAnchor="text"/>
+      </w:pPr>
+      <w:r>
+        <w:rPr/>
+        <w:t xml:space="preserve">Framed paragraph — floats in a 3-inch box with text wrapping around it, anchored to the margin.</w:t>
       </w:r>
     </w:p>
     <w:p>

</xml_diff>